<commit_message>
Complete initial MED dialogue metadata
</commit_message>
<xml_diff>
--- a/18_DOCX/MED_DIALOGUES_0001_0005.docx
+++ b/18_DOCX/MED_DIALOGUES_0001_0005.docx
@@ -7,14 +7,61 @@
         <w:pStyle w:val="Heading1"/>
       </w:pPr>
       <w:r>
-        <w:t>MED_DIALOGUES_0001_0005 - Primeiro ciclo de diálogos MED</w:t>
-      </w:r>
-    </w:p>
-    <w:p>
-      <w:r>
-        <w:t>————————————————————————</w:t>
-      </w:r>
-    </w:p>
+        <w:t>MED_DIALOGUES_0001_0005 - Diálogos MED</w:t>
+      </w:r>
+    </w:p>
+    <w:p/>
+    <w:p>
+      <w:pPr>
+        <w:pStyle w:val="Heading2"/>
+      </w:pPr>
+      <w:r>
+        <w:t>Controle</w:t>
+      </w:r>
+    </w:p>
+    <w:p/>
+    <w:p>
+      <w:pPr>
+        <w:pStyle w:val="ListBullet"/>
+      </w:pPr>
+      <w:r>
+        <w:t>Versão: 0.2</w:t>
+      </w:r>
+    </w:p>
+    <w:p>
+      <w:pPr>
+        <w:pStyle w:val="ListBullet"/>
+      </w:pPr>
+      <w:r>
+        <w:t>Data: 2026-06-27</w:t>
+      </w:r>
+    </w:p>
+    <w:p>
+      <w:pPr>
+        <w:pStyle w:val="ListBullet"/>
+      </w:pPr>
+      <w:r>
+        <w:t>Autor: JP-BR Insurance Knowledge Base</w:t>
+      </w:r>
+    </w:p>
+    <w:p>
+      <w:pPr>
+        <w:pStyle w:val="ListBullet"/>
+      </w:pPr>
+      <w:r>
+        <w:t>Histórico: Consolidação atualizada com pontos de atenção e casos relacionados.</w:t>
+      </w:r>
+    </w:p>
+    <w:p/>
+    <w:p>
+      <w:pPr>
+        <w:pStyle w:val="Heading2"/>
+      </w:pPr>
+      <w:r>
+        <w:t>Conteúdo consolidado</w:t>
+      </w:r>
+    </w:p>
+    <w:p/>
     <w:p>
       <w:pPr>
         <w:pStyle w:val="Heading1"/>
@@ -23,6 +70,7 @@
         <w:t>DIALOGUE-MED-0001 - Explicando seguro médico, internação e cirurgia</w:t>
       </w:r>
     </w:p>
+    <w:p/>
     <w:p>
       <w:pPr>
         <w:pStyle w:val="Heading2"/>
@@ -31,12 +79,13 @@
         <w:t>Controle</w:t>
       </w:r>
     </w:p>
+    <w:p/>
     <w:p>
       <w:pPr>
         <w:pStyle w:val="ListBullet"/>
       </w:pPr>
       <w:r>
-        <w:t>Versão: 0.1</w:t>
+        <w:t>Versão: 0.2</w:t>
       </w:r>
     </w:p>
     <w:p>
@@ -60,9 +109,10 @@
         <w:pStyle w:val="ListBullet"/>
       </w:pPr>
       <w:r>
-        <w:t>Histórico: Criação inicial.</w:t>
-      </w:r>
-    </w:p>
+        <w:t>Histórico: Criação inicial; reforço de pontos de atenção e casos relacionados.</w:t>
+      </w:r>
+    </w:p>
+    <w:p/>
     <w:p>
       <w:pPr>
         <w:pStyle w:val="Heading2"/>
@@ -71,11 +121,13 @@
         <w:t>Código</w:t>
       </w:r>
     </w:p>
+    <w:p/>
     <w:p>
       <w:r>
         <w:t>DIALOGUE-MED-0001</w:t>
       </w:r>
     </w:p>
+    <w:p/>
     <w:p>
       <w:pPr>
         <w:pStyle w:val="Heading2"/>
@@ -84,11 +136,13 @@
         <w:t>Situação de atendimento</w:t>
       </w:r>
     </w:p>
+    <w:p/>
     <w:p>
       <w:r>
         <w:t>Cliente brasileiro quer entender como funciona o seguro médico no Japão.</w:t>
       </w:r>
     </w:p>
+    <w:p/>
     <w:p>
       <w:pPr>
         <w:pStyle w:val="Heading2"/>
@@ -97,6 +151,7 @@
         <w:t>Participantes</w:t>
       </w:r>
     </w:p>
+    <w:p/>
     <w:p>
       <w:pPr>
         <w:pStyle w:val="ListBullet"/>
@@ -113,6 +168,7 @@
         <w:t>Cliente: cliente brasileiro residente no Japão</w:t>
       </w:r>
     </w:p>
+    <w:p/>
     <w:p>
       <w:pPr>
         <w:pStyle w:val="Heading2"/>
@@ -121,11 +177,13 @@
         <w:t>Objetivo do diálogo</w:t>
       </w:r>
     </w:p>
+    <w:p/>
     <w:p>
       <w:r>
         <w:t>Explicando seguro médico, internação e cirurgia.</w:t>
       </w:r>
     </w:p>
+    <w:p/>
     <w:p>
       <w:pPr>
         <w:pStyle w:val="Heading2"/>
@@ -134,26 +192,31 @@
         <w:t>Versão em japonês</w:t>
       </w:r>
     </w:p>
+    <w:p/>
     <w:p>
       <w:r>
         <w:t>**Cliente:** 医療保険では何が支払われますか。</w:t>
       </w:r>
     </w:p>
+    <w:p/>
     <w:p>
       <w:r>
         <w:t>**Corretor:** 入院、手術、通院、先進医療など、契約内容によって支払い対象が異なります。</w:t>
       </w:r>
     </w:p>
+    <w:p/>
     <w:p>
       <w:r>
         <w:t>**Cliente:** 病気があれば入れますか。</w:t>
       </w:r>
     </w:p>
+    <w:p/>
     <w:p>
       <w:r>
         <w:t>**Corretor:** 健康状態や告知内容を保険会社が確認します。正確に申告することが大切です。</w:t>
       </w:r>
     </w:p>
+    <w:p/>
     <w:p>
       <w:pPr>
         <w:pStyle w:val="Heading2"/>
@@ -162,26 +225,31 @@
         <w:t>Versão em português brasileiro</w:t>
       </w:r>
     </w:p>
+    <w:p/>
     <w:p>
       <w:r>
         <w:t>**Cliente:** O que o seguro médico paga?</w:t>
       </w:r>
     </w:p>
+    <w:p/>
     <w:p>
       <w:r>
         <w:t>**Corretor:** Depende do contrato. Pode haver benefícios para internação, cirurgia, tratamento ambulatorial e tratamento avançado.</w:t>
       </w:r>
     </w:p>
+    <w:p/>
     <w:p>
       <w:r>
         <w:t>**Cliente:** Se eu já tiver doença, posso contratar?</w:t>
       </w:r>
     </w:p>
+    <w:p/>
     <w:p>
       <w:r>
         <w:t>**Corretor:** A seguradora analisa a condição de saúde e a declaração. É importante informar corretamente.</w:t>
       </w:r>
     </w:p>
+    <w:p/>
     <w:p>
       <w:pPr>
         <w:pStyle w:val="Heading2"/>
@@ -190,6 +258,7 @@
         <w:t>Notas culturais ou comerciais</w:t>
       </w:r>
     </w:p>
+    <w:p/>
     <w:p>
       <w:pPr>
         <w:pStyle w:val="ListBullet"/>
@@ -206,14 +275,76 @@
         <w:t>Separar benefício contratado de reembolso médico genérico.</w:t>
       </w:r>
     </w:p>
+    <w:p/>
     <w:p>
       <w:pPr>
         <w:pStyle w:val="Heading2"/>
       </w:pPr>
       <w:r>
+        <w:t>Pontos de atenção para o corretor</w:t>
+      </w:r>
+    </w:p>
+    <w:p/>
+    <w:p>
+      <w:pPr>
+        <w:pStyle w:val="ListBullet"/>
+      </w:pPr>
+      <w:r>
+        <w:t>Registrar a dúvida principal do cliente antes de explicar detalhes técnicos.</w:t>
+      </w:r>
+    </w:p>
+    <w:p>
+      <w:pPr>
+        <w:pStyle w:val="ListBullet"/>
+      </w:pPr>
+      <w:r>
+        <w:t>Separar explicação comercial de decisão formal da seguradora.</w:t>
+      </w:r>
+    </w:p>
+    <w:p>
+      <w:pPr>
+        <w:pStyle w:val="ListBullet"/>
+      </w:pPr>
+      <w:r>
+        <w:t>Confirmar contrato, documentos e declaração de saúde antes de responder sobre pagamento.</w:t>
+      </w:r>
+    </w:p>
+    <w:p/>
+    <w:p>
+      <w:pPr>
+        <w:pStyle w:val="Heading2"/>
+      </w:pPr>
+      <w:r>
+        <w:t>Casos relacionados</w:t>
+      </w:r>
+    </w:p>
+    <w:p/>
+    <w:p>
+      <w:pPr>
+        <w:pStyle w:val="ListBullet"/>
+      </w:pPr>
+      <w:r>
+        <w:t>CASE-MED-0001</w:t>
+      </w:r>
+    </w:p>
+    <w:p>
+      <w:pPr>
+        <w:pStyle w:val="ListBullet"/>
+      </w:pPr>
+      <w:r>
+        <w:t>CASE-MED-0002</w:t>
+      </w:r>
+    </w:p>
+    <w:p/>
+    <w:p>
+      <w:pPr>
+        <w:pStyle w:val="Heading2"/>
+      </w:pPr>
+      <w:r>
         <w:t>Termos relacionados</w:t>
       </w:r>
     </w:p>
+    <w:p/>
     <w:p>
       <w:pPr>
         <w:pStyle w:val="ListBullet"/>
@@ -246,6 +377,7 @@
         <w:t>MED-0004 - 通院給付金 - Benefício por tratamento ambulatorial</w:t>
       </w:r>
     </w:p>
+    <w:p/>
     <w:p>
       <w:pPr>
         <w:pStyle w:val="Heading2"/>
@@ -254,6 +386,7 @@
         <w:t>FAQs relacionadas</w:t>
       </w:r>
     </w:p>
+    <w:p/>
     <w:p>
       <w:pPr>
         <w:pStyle w:val="ListBullet"/>
@@ -286,6 +419,7 @@
         <w:t>FAQ-MED-0004</w:t>
       </w:r>
     </w:p>
+    <w:p/>
     <w:p>
       <w:pPr>
         <w:pStyle w:val="Heading2"/>
@@ -294,6 +428,7 @@
         <w:t>Referências cruzadas</w:t>
       </w:r>
     </w:p>
+    <w:p/>
     <w:p>
       <w:pPr>
         <w:pStyle w:val="ListBullet"/>
@@ -310,6 +445,7 @@
         <w:t>CASE-MED-0002</w:t>
       </w:r>
     </w:p>
+    <w:p/>
     <w:p>
       <w:pPr>
         <w:pStyle w:val="Heading2"/>
@@ -318,6 +454,7 @@
         <w:t>Referências</w:t>
       </w:r>
     </w:p>
+    <w:p/>
     <w:p>
       <w:pPr>
         <w:pStyle w:val="ListBullet"/>
@@ -326,6 +463,7 @@
         <w:t>Documento interno: `02_MasterDictionary/MED/MED-0001.md`</w:t>
       </w:r>
     </w:p>
+    <w:p/>
     <w:p>
       <w:pPr>
         <w:pStyle w:val="Heading2"/>
@@ -334,6 +472,7 @@
         <w:t>Tags</w:t>
       </w:r>
     </w:p>
+    <w:p/>
     <w:p>
       <w:pPr>
         <w:pStyle w:val="ListBullet"/>
@@ -366,6 +505,7 @@
         <w:t>atendimento</w:t>
       </w:r>
     </w:p>
+    <w:p/>
     <w:p>
       <w:pPr>
         <w:pStyle w:val="Heading2"/>
@@ -374,6 +514,7 @@
         <w:t>Veja também</w:t>
       </w:r>
     </w:p>
+    <w:p/>
     <w:p>
       <w:pPr>
         <w:pStyle w:val="ListBullet"/>
@@ -382,6 +523,7 @@
         <w:t>`14_FAQ/MED/FAQ-MED-0001.md`</w:t>
       </w:r>
     </w:p>
+    <w:p/>
     <w:p>
       <w:pPr>
         <w:pStyle w:val="Heading2"/>
@@ -390,6 +532,7 @@
         <w:t>Histórico de revisão</w:t>
       </w:r>
     </w:p>
+    <w:p/>
     <w:p>
       <w:r>
         <w:t>| Data | Versão | Autor | Alteração |</w:t>
@@ -407,9 +550,16 @@
     </w:p>
     <w:p>
       <w:r>
-        <w:t>————————————————————————</w:t>
-      </w:r>
-    </w:p>
+        <w:t>| 2026-06-27 | 0.2 | JP-BR Insurance Knowledge Base | Inclusão de pontos de atenção para o corretor e casos relacionados. |</w:t>
+      </w:r>
+    </w:p>
+    <w:p/>
+    <w:p>
+      <w:r>
+        <w:br w:type="page"/>
+      </w:r>
+    </w:p>
+    <w:p/>
     <w:p>
       <w:pPr>
         <w:pStyle w:val="Heading1"/>
@@ -418,6 +568,7 @@
         <w:t>DIALOGUE-MED-0002 - Explicando valor diário, dias pagos e limite</w:t>
       </w:r>
     </w:p>
+    <w:p/>
     <w:p>
       <w:pPr>
         <w:pStyle w:val="Heading2"/>
@@ -426,12 +577,13 @@
         <w:t>Controle</w:t>
       </w:r>
     </w:p>
+    <w:p/>
     <w:p>
       <w:pPr>
         <w:pStyle w:val="ListBullet"/>
       </w:pPr>
       <w:r>
-        <w:t>Versão: 0.1</w:t>
+        <w:t>Versão: 0.2</w:t>
       </w:r>
     </w:p>
     <w:p>
@@ -455,9 +607,10 @@
         <w:pStyle w:val="ListBullet"/>
       </w:pPr>
       <w:r>
-        <w:t>Histórico: Criação inicial.</w:t>
-      </w:r>
-    </w:p>
+        <w:t>Histórico: Criação inicial; reforço de pontos de atenção e casos relacionados.</w:t>
+      </w:r>
+    </w:p>
+    <w:p/>
     <w:p>
       <w:pPr>
         <w:pStyle w:val="Heading2"/>
@@ -466,11 +619,13 @@
         <w:t>Código</w:t>
       </w:r>
     </w:p>
+    <w:p/>
     <w:p>
       <w:r>
         <w:t>DIALOGUE-MED-0002</w:t>
       </w:r>
     </w:p>
+    <w:p/>
     <w:p>
       <w:pPr>
         <w:pStyle w:val="Heading2"/>
@@ -479,11 +634,13 @@
         <w:t>Situação de atendimento</w:t>
       </w:r>
     </w:p>
+    <w:p/>
     <w:p>
       <w:r>
         <w:t>Cliente brasileiro quer entender como funciona o seguro médico no Japão.</w:t>
       </w:r>
     </w:p>
+    <w:p/>
     <w:p>
       <w:pPr>
         <w:pStyle w:val="Heading2"/>
@@ -492,6 +649,7 @@
         <w:t>Participantes</w:t>
       </w:r>
     </w:p>
+    <w:p/>
     <w:p>
       <w:pPr>
         <w:pStyle w:val="ListBullet"/>
@@ -508,6 +666,7 @@
         <w:t>Cliente: cliente brasileiro residente no Japão</w:t>
       </w:r>
     </w:p>
+    <w:p/>
     <w:p>
       <w:pPr>
         <w:pStyle w:val="Heading2"/>
@@ -516,11 +675,13 @@
         <w:t>Objetivo do diálogo</w:t>
       </w:r>
     </w:p>
+    <w:p/>
     <w:p>
       <w:r>
         <w:t>Explicando valor diário, dias pagos e limite.</w:t>
       </w:r>
     </w:p>
+    <w:p/>
     <w:p>
       <w:pPr>
         <w:pStyle w:val="Heading2"/>
@@ -529,26 +690,31 @@
         <w:t>Versão em japonês</w:t>
       </w:r>
     </w:p>
+    <w:p/>
     <w:p>
       <w:r>
         <w:t>**Cliente:** 医療保険では何が支払われますか。</w:t>
       </w:r>
     </w:p>
+    <w:p/>
     <w:p>
       <w:r>
         <w:t>**Corretor:** 入院、手術、通院、先進医療など、契約内容によって支払い対象が異なります。</w:t>
       </w:r>
     </w:p>
+    <w:p/>
     <w:p>
       <w:r>
         <w:t>**Cliente:** 病気があれば入れますか。</w:t>
       </w:r>
     </w:p>
+    <w:p/>
     <w:p>
       <w:r>
         <w:t>**Corretor:** 健康状態や告知内容を保険会社が確認します。正確に申告することが大切です。</w:t>
       </w:r>
     </w:p>
+    <w:p/>
     <w:p>
       <w:pPr>
         <w:pStyle w:val="Heading2"/>
@@ -557,26 +723,31 @@
         <w:t>Versão em português brasileiro</w:t>
       </w:r>
     </w:p>
+    <w:p/>
     <w:p>
       <w:r>
         <w:t>**Cliente:** O que o seguro médico paga?</w:t>
       </w:r>
     </w:p>
+    <w:p/>
     <w:p>
       <w:r>
         <w:t>**Corretor:** Depende do contrato. Pode haver benefícios para internação, cirurgia, tratamento ambulatorial e tratamento avançado.</w:t>
       </w:r>
     </w:p>
+    <w:p/>
     <w:p>
       <w:r>
         <w:t>**Cliente:** Se eu já tiver doença, posso contratar?</w:t>
       </w:r>
     </w:p>
+    <w:p/>
     <w:p>
       <w:r>
         <w:t>**Corretor:** A seguradora analisa a condição de saúde e a declaração. É importante informar corretamente.</w:t>
       </w:r>
     </w:p>
+    <w:p/>
     <w:p>
       <w:pPr>
         <w:pStyle w:val="Heading2"/>
@@ -585,6 +756,7 @@
         <w:t>Notas culturais ou comerciais</w:t>
       </w:r>
     </w:p>
+    <w:p/>
     <w:p>
       <w:pPr>
         <w:pStyle w:val="ListBullet"/>
@@ -601,14 +773,76 @@
         <w:t>Separar benefício contratado de reembolso médico genérico.</w:t>
       </w:r>
     </w:p>
+    <w:p/>
     <w:p>
       <w:pPr>
         <w:pStyle w:val="Heading2"/>
       </w:pPr>
       <w:r>
+        <w:t>Pontos de atenção para o corretor</w:t>
+      </w:r>
+    </w:p>
+    <w:p/>
+    <w:p>
+      <w:pPr>
+        <w:pStyle w:val="ListBullet"/>
+      </w:pPr>
+      <w:r>
+        <w:t>Registrar a dúvida principal do cliente antes de explicar detalhes técnicos.</w:t>
+      </w:r>
+    </w:p>
+    <w:p>
+      <w:pPr>
+        <w:pStyle w:val="ListBullet"/>
+      </w:pPr>
+      <w:r>
+        <w:t>Separar explicação comercial de decisão formal da seguradora.</w:t>
+      </w:r>
+    </w:p>
+    <w:p>
+      <w:pPr>
+        <w:pStyle w:val="ListBullet"/>
+      </w:pPr>
+      <w:r>
+        <w:t>Confirmar contrato, documentos e declaração de saúde antes de responder sobre pagamento.</w:t>
+      </w:r>
+    </w:p>
+    <w:p/>
+    <w:p>
+      <w:pPr>
+        <w:pStyle w:val="Heading2"/>
+      </w:pPr>
+      <w:r>
+        <w:t>Casos relacionados</w:t>
+      </w:r>
+    </w:p>
+    <w:p/>
+    <w:p>
+      <w:pPr>
+        <w:pStyle w:val="ListBullet"/>
+      </w:pPr>
+      <w:r>
+        <w:t>CASE-MED-0003</w:t>
+      </w:r>
+    </w:p>
+    <w:p>
+      <w:pPr>
+        <w:pStyle w:val="ListBullet"/>
+      </w:pPr>
+      <w:r>
+        <w:t>CASE-MED-0004</w:t>
+      </w:r>
+    </w:p>
+    <w:p/>
+    <w:p>
+      <w:pPr>
+        <w:pStyle w:val="Heading2"/>
+      </w:pPr>
+      <w:r>
         <w:t>Termos relacionados</w:t>
       </w:r>
     </w:p>
+    <w:p/>
     <w:p>
       <w:pPr>
         <w:pStyle w:val="ListBullet"/>
@@ -641,6 +875,7 @@
         <w:t>MED-0008 - 免責期間 - Período de carência ou não pagamento</w:t>
       </w:r>
     </w:p>
+    <w:p/>
     <w:p>
       <w:pPr>
         <w:pStyle w:val="Heading2"/>
@@ -649,6 +884,7 @@
         <w:t>FAQs relacionadas</w:t>
       </w:r>
     </w:p>
+    <w:p/>
     <w:p>
       <w:pPr>
         <w:pStyle w:val="ListBullet"/>
@@ -681,6 +917,7 @@
         <w:t>FAQ-MED-0008</w:t>
       </w:r>
     </w:p>
+    <w:p/>
     <w:p>
       <w:pPr>
         <w:pStyle w:val="Heading2"/>
@@ -689,6 +926,7 @@
         <w:t>Referências cruzadas</w:t>
       </w:r>
     </w:p>
+    <w:p/>
     <w:p>
       <w:pPr>
         <w:pStyle w:val="ListBullet"/>
@@ -697,6 +935,7 @@
         <w:t>CASE-MED-0003</w:t>
       </w:r>
     </w:p>
+    <w:p/>
     <w:p>
       <w:pPr>
         <w:pStyle w:val="Heading2"/>
@@ -705,6 +944,7 @@
         <w:t>Referências</w:t>
       </w:r>
     </w:p>
+    <w:p/>
     <w:p>
       <w:pPr>
         <w:pStyle w:val="ListBullet"/>
@@ -713,6 +953,7 @@
         <w:t>Documento interno: `02_MasterDictionary/MED/MED-0005.md`</w:t>
       </w:r>
     </w:p>
+    <w:p/>
     <w:p>
       <w:pPr>
         <w:pStyle w:val="Heading2"/>
@@ -721,6 +962,7 @@
         <w:t>Tags</w:t>
       </w:r>
     </w:p>
+    <w:p/>
     <w:p>
       <w:pPr>
         <w:pStyle w:val="ListBullet"/>
@@ -753,6 +995,7 @@
         <w:t>atendimento</w:t>
       </w:r>
     </w:p>
+    <w:p/>
     <w:p>
       <w:pPr>
         <w:pStyle w:val="Heading2"/>
@@ -761,6 +1004,7 @@
         <w:t>Veja também</w:t>
       </w:r>
     </w:p>
+    <w:p/>
     <w:p>
       <w:pPr>
         <w:pStyle w:val="ListBullet"/>
@@ -769,6 +1013,7 @@
         <w:t>`14_FAQ/MED/FAQ-MED-0005.md`</w:t>
       </w:r>
     </w:p>
+    <w:p/>
     <w:p>
       <w:pPr>
         <w:pStyle w:val="Heading2"/>
@@ -777,6 +1022,7 @@
         <w:t>Histórico de revisão</w:t>
       </w:r>
     </w:p>
+    <w:p/>
     <w:p>
       <w:r>
         <w:t>| Data | Versão | Autor | Alteração |</w:t>
@@ -794,9 +1040,16 @@
     </w:p>
     <w:p>
       <w:r>
-        <w:t>————————————————————————</w:t>
-      </w:r>
-    </w:p>
+        <w:t>| 2026-06-27 | 0.2 | JP-BR Insurance Knowledge Base | Inclusão de pontos de atenção para o corretor e casos relacionados. |</w:t>
+      </w:r>
+    </w:p>
+    <w:p/>
+    <w:p>
+      <w:r>
+        <w:br w:type="page"/>
+      </w:r>
+    </w:p>
+    <w:p/>
     <w:p>
       <w:pPr>
         <w:pStyle w:val="Heading1"/>
@@ -805,6 +1058,7 @@
         <w:t>DIALOGUE-MED-0003 - Orientando tratamento avançado, câncer e três doenças graves</w:t>
       </w:r>
     </w:p>
+    <w:p/>
     <w:p>
       <w:pPr>
         <w:pStyle w:val="Heading2"/>
@@ -813,12 +1067,13 @@
         <w:t>Controle</w:t>
       </w:r>
     </w:p>
+    <w:p/>
     <w:p>
       <w:pPr>
         <w:pStyle w:val="ListBullet"/>
       </w:pPr>
       <w:r>
-        <w:t>Versão: 0.1</w:t>
+        <w:t>Versão: 0.2</w:t>
       </w:r>
     </w:p>
     <w:p>
@@ -842,9 +1097,10 @@
         <w:pStyle w:val="ListBullet"/>
       </w:pPr>
       <w:r>
-        <w:t>Histórico: Criação inicial.</w:t>
-      </w:r>
-    </w:p>
+        <w:t>Histórico: Criação inicial; reforço de pontos de atenção e casos relacionados.</w:t>
+      </w:r>
+    </w:p>
+    <w:p/>
     <w:p>
       <w:pPr>
         <w:pStyle w:val="Heading2"/>
@@ -853,11 +1109,13 @@
         <w:t>Código</w:t>
       </w:r>
     </w:p>
+    <w:p/>
     <w:p>
       <w:r>
         <w:t>DIALOGUE-MED-0003</w:t>
       </w:r>
     </w:p>
+    <w:p/>
     <w:p>
       <w:pPr>
         <w:pStyle w:val="Heading2"/>
@@ -866,11 +1124,13 @@
         <w:t>Situação de atendimento</w:t>
       </w:r>
     </w:p>
+    <w:p/>
     <w:p>
       <w:r>
         <w:t>Cliente brasileiro quer entender como funciona o seguro médico no Japão.</w:t>
       </w:r>
     </w:p>
+    <w:p/>
     <w:p>
       <w:pPr>
         <w:pStyle w:val="Heading2"/>
@@ -879,6 +1139,7 @@
         <w:t>Participantes</w:t>
       </w:r>
     </w:p>
+    <w:p/>
     <w:p>
       <w:pPr>
         <w:pStyle w:val="ListBullet"/>
@@ -895,6 +1156,7 @@
         <w:t>Cliente: cliente brasileiro residente no Japão</w:t>
       </w:r>
     </w:p>
+    <w:p/>
     <w:p>
       <w:pPr>
         <w:pStyle w:val="Heading2"/>
@@ -903,11 +1165,13 @@
         <w:t>Objetivo do diálogo</w:t>
       </w:r>
     </w:p>
+    <w:p/>
     <w:p>
       <w:r>
         <w:t>Orientando tratamento avançado, câncer e três doenças graves.</w:t>
       </w:r>
     </w:p>
+    <w:p/>
     <w:p>
       <w:pPr>
         <w:pStyle w:val="Heading2"/>
@@ -916,26 +1180,31 @@
         <w:t>Versão em japonês</w:t>
       </w:r>
     </w:p>
+    <w:p/>
     <w:p>
       <w:r>
         <w:t>**Cliente:** 医療保険では何が支払われますか。</w:t>
       </w:r>
     </w:p>
+    <w:p/>
     <w:p>
       <w:r>
         <w:t>**Corretor:** 入院、手術、通院、先進医療など、契約内容によって支払い対象が異なります。</w:t>
       </w:r>
     </w:p>
+    <w:p/>
     <w:p>
       <w:r>
         <w:t>**Cliente:** 病気があれば入れますか。</w:t>
       </w:r>
     </w:p>
+    <w:p/>
     <w:p>
       <w:r>
         <w:t>**Corretor:** 健康状態や告知内容を保険会社が確認します。正確に申告することが大切です。</w:t>
       </w:r>
     </w:p>
+    <w:p/>
     <w:p>
       <w:pPr>
         <w:pStyle w:val="Heading2"/>
@@ -944,26 +1213,31 @@
         <w:t>Versão em português brasileiro</w:t>
       </w:r>
     </w:p>
+    <w:p/>
     <w:p>
       <w:r>
         <w:t>**Cliente:** O que o seguro médico paga?</w:t>
       </w:r>
     </w:p>
+    <w:p/>
     <w:p>
       <w:r>
         <w:t>**Corretor:** Depende do contrato. Pode haver benefícios para internação, cirurgia, tratamento ambulatorial e tratamento avançado.</w:t>
       </w:r>
     </w:p>
+    <w:p/>
     <w:p>
       <w:r>
         <w:t>**Cliente:** Se eu já tiver doença, posso contratar?</w:t>
       </w:r>
     </w:p>
+    <w:p/>
     <w:p>
       <w:r>
         <w:t>**Corretor:** A seguradora analisa a condição de saúde e a declaração. É importante informar corretamente.</w:t>
       </w:r>
     </w:p>
+    <w:p/>
     <w:p>
       <w:pPr>
         <w:pStyle w:val="Heading2"/>
@@ -972,6 +1246,7 @@
         <w:t>Notas culturais ou comerciais</w:t>
       </w:r>
     </w:p>
+    <w:p/>
     <w:p>
       <w:pPr>
         <w:pStyle w:val="ListBullet"/>
@@ -988,14 +1263,68 @@
         <w:t>Separar benefício contratado de reembolso médico genérico.</w:t>
       </w:r>
     </w:p>
+    <w:p/>
     <w:p>
       <w:pPr>
         <w:pStyle w:val="Heading2"/>
       </w:pPr>
       <w:r>
+        <w:t>Pontos de atenção para o corretor</w:t>
+      </w:r>
+    </w:p>
+    <w:p/>
+    <w:p>
+      <w:pPr>
+        <w:pStyle w:val="ListBullet"/>
+      </w:pPr>
+      <w:r>
+        <w:t>Registrar a dúvida principal do cliente antes de explicar detalhes técnicos.</w:t>
+      </w:r>
+    </w:p>
+    <w:p>
+      <w:pPr>
+        <w:pStyle w:val="ListBullet"/>
+      </w:pPr>
+      <w:r>
+        <w:t>Separar explicação comercial de decisão formal da seguradora.</w:t>
+      </w:r>
+    </w:p>
+    <w:p>
+      <w:pPr>
+        <w:pStyle w:val="ListBullet"/>
+      </w:pPr>
+      <w:r>
+        <w:t>Confirmar contrato, documentos e declaração de saúde antes de responder sobre pagamento.</w:t>
+      </w:r>
+    </w:p>
+    <w:p/>
+    <w:p>
+      <w:pPr>
+        <w:pStyle w:val="Heading2"/>
+      </w:pPr>
+      <w:r>
+        <w:t>Casos relacionados</w:t>
+      </w:r>
+    </w:p>
+    <w:p/>
+    <w:p>
+      <w:pPr>
+        <w:pStyle w:val="ListBullet"/>
+      </w:pPr>
+      <w:r>
+        <w:t>CASE-MED-0005</w:t>
+      </w:r>
+    </w:p>
+    <w:p/>
+    <w:p>
+      <w:pPr>
+        <w:pStyle w:val="Heading2"/>
+      </w:pPr>
+      <w:r>
         <w:t>Termos relacionados</w:t>
       </w:r>
     </w:p>
+    <w:p/>
     <w:p>
       <w:pPr>
         <w:pStyle w:val="ListBullet"/>
@@ -1028,6 +1357,7 @@
         <w:t>MED-0012 - 三大疾病保障 - Cobertura para três doenças graves</w:t>
       </w:r>
     </w:p>
+    <w:p/>
     <w:p>
       <w:pPr>
         <w:pStyle w:val="Heading2"/>
@@ -1036,6 +1366,7 @@
         <w:t>FAQs relacionadas</w:t>
       </w:r>
     </w:p>
+    <w:p/>
     <w:p>
       <w:pPr>
         <w:pStyle w:val="ListBullet"/>
@@ -1068,6 +1399,7 @@
         <w:t>FAQ-MED-0012</w:t>
       </w:r>
     </w:p>
+    <w:p/>
     <w:p>
       <w:pPr>
         <w:pStyle w:val="Heading2"/>
@@ -1076,6 +1408,7 @@
         <w:t>Referências cruzadas</w:t>
       </w:r>
     </w:p>
+    <w:p/>
     <w:p>
       <w:pPr>
         <w:pStyle w:val="ListBullet"/>
@@ -1092,6 +1425,7 @@
         <w:t>CASE-MED-0005</w:t>
       </w:r>
     </w:p>
+    <w:p/>
     <w:p>
       <w:pPr>
         <w:pStyle w:val="Heading2"/>
@@ -1100,6 +1434,7 @@
         <w:t>Referências</w:t>
       </w:r>
     </w:p>
+    <w:p/>
     <w:p>
       <w:pPr>
         <w:pStyle w:val="ListBullet"/>
@@ -1108,6 +1443,7 @@
         <w:t>Documento interno: `02_MasterDictionary/MED/MED-0009.md`</w:t>
       </w:r>
     </w:p>
+    <w:p/>
     <w:p>
       <w:pPr>
         <w:pStyle w:val="Heading2"/>
@@ -1116,6 +1452,7 @@
         <w:t>Tags</w:t>
       </w:r>
     </w:p>
+    <w:p/>
     <w:p>
       <w:pPr>
         <w:pStyle w:val="ListBullet"/>
@@ -1148,6 +1485,7 @@
         <w:t>atendimento</w:t>
       </w:r>
     </w:p>
+    <w:p/>
     <w:p>
       <w:pPr>
         <w:pStyle w:val="Heading2"/>
@@ -1156,6 +1494,7 @@
         <w:t>Veja também</w:t>
       </w:r>
     </w:p>
+    <w:p/>
     <w:p>
       <w:pPr>
         <w:pStyle w:val="ListBullet"/>
@@ -1164,6 +1503,7 @@
         <w:t>`14_FAQ/MED/FAQ-MED-0009.md`</w:t>
       </w:r>
     </w:p>
+    <w:p/>
     <w:p>
       <w:pPr>
         <w:pStyle w:val="Heading2"/>
@@ -1172,6 +1512,7 @@
         <w:t>Histórico de revisão</w:t>
       </w:r>
     </w:p>
+    <w:p/>
     <w:p>
       <w:r>
         <w:t>| Data | Versão | Autor | Alteração |</w:t>
@@ -1189,9 +1530,16 @@
     </w:p>
     <w:p>
       <w:r>
-        <w:t>————————————————————————</w:t>
-      </w:r>
-    </w:p>
+        <w:t>| 2026-06-27 | 0.2 | JP-BR Insurance Knowledge Base | Inclusão de pontos de atenção para o corretor e casos relacionados. |</w:t>
+      </w:r>
+    </w:p>
+    <w:p/>
+    <w:p>
+      <w:r>
+        <w:br w:type="page"/>
+      </w:r>
+    </w:p>
+    <w:p/>
     <w:p>
       <w:pPr>
         <w:pStyle w:val="Heading1"/>
@@ -1200,6 +1548,7 @@
         <w:t>DIALOGUE-MED-0004 - Comparando doenças de estilo de vida, femininas e parto</w:t>
       </w:r>
     </w:p>
+    <w:p/>
     <w:p>
       <w:pPr>
         <w:pStyle w:val="Heading2"/>
@@ -1208,12 +1557,13 @@
         <w:t>Controle</w:t>
       </w:r>
     </w:p>
+    <w:p/>
     <w:p>
       <w:pPr>
         <w:pStyle w:val="ListBullet"/>
       </w:pPr>
       <w:r>
-        <w:t>Versão: 0.1</w:t>
+        <w:t>Versão: 0.2</w:t>
       </w:r>
     </w:p>
     <w:p>
@@ -1237,9 +1587,10 @@
         <w:pStyle w:val="ListBullet"/>
       </w:pPr>
       <w:r>
-        <w:t>Histórico: Criação inicial.</w:t>
-      </w:r>
-    </w:p>
+        <w:t>Histórico: Criação inicial; reforço de pontos de atenção e casos relacionados.</w:t>
+      </w:r>
+    </w:p>
+    <w:p/>
     <w:p>
       <w:pPr>
         <w:pStyle w:val="Heading2"/>
@@ -1248,11 +1599,13 @@
         <w:t>Código</w:t>
       </w:r>
     </w:p>
+    <w:p/>
     <w:p>
       <w:r>
         <w:t>DIALOGUE-MED-0004</w:t>
       </w:r>
     </w:p>
+    <w:p/>
     <w:p>
       <w:pPr>
         <w:pStyle w:val="Heading2"/>
@@ -1261,11 +1614,13 @@
         <w:t>Situação de atendimento</w:t>
       </w:r>
     </w:p>
+    <w:p/>
     <w:p>
       <w:r>
         <w:t>Cliente brasileiro quer entender como funciona o seguro médico no Japão.</w:t>
       </w:r>
     </w:p>
+    <w:p/>
     <w:p>
       <w:pPr>
         <w:pStyle w:val="Heading2"/>
@@ -1274,6 +1629,7 @@
         <w:t>Participantes</w:t>
       </w:r>
     </w:p>
+    <w:p/>
     <w:p>
       <w:pPr>
         <w:pStyle w:val="ListBullet"/>
@@ -1290,6 +1646,7 @@
         <w:t>Cliente: cliente brasileiro residente no Japão</w:t>
       </w:r>
     </w:p>
+    <w:p/>
     <w:p>
       <w:pPr>
         <w:pStyle w:val="Heading2"/>
@@ -1298,11 +1655,13 @@
         <w:t>Objetivo do diálogo</w:t>
       </w:r>
     </w:p>
+    <w:p/>
     <w:p>
       <w:r>
         <w:t>Comparando doenças de estilo de vida, femininas e parto.</w:t>
       </w:r>
     </w:p>
+    <w:p/>
     <w:p>
       <w:pPr>
         <w:pStyle w:val="Heading2"/>
@@ -1311,26 +1670,31 @@
         <w:t>Versão em japonês</w:t>
       </w:r>
     </w:p>
+    <w:p/>
     <w:p>
       <w:r>
         <w:t>**Cliente:** 医療保険では何が支払われますか。</w:t>
       </w:r>
     </w:p>
+    <w:p/>
     <w:p>
       <w:r>
         <w:t>**Corretor:** 入院、手術、通院、先進医療など、契約内容によって支払い対象が異なります。</w:t>
       </w:r>
     </w:p>
+    <w:p/>
     <w:p>
       <w:r>
         <w:t>**Cliente:** 病気があれば入れますか。</w:t>
       </w:r>
     </w:p>
+    <w:p/>
     <w:p>
       <w:r>
         <w:t>**Corretor:** 健康状態や告知内容を保険会社が確認します。正確に申告することが大切です。</w:t>
       </w:r>
     </w:p>
+    <w:p/>
     <w:p>
       <w:pPr>
         <w:pStyle w:val="Heading2"/>
@@ -1339,26 +1703,31 @@
         <w:t>Versão em português brasileiro</w:t>
       </w:r>
     </w:p>
+    <w:p/>
     <w:p>
       <w:r>
         <w:t>**Cliente:** O que o seguro médico paga?</w:t>
       </w:r>
     </w:p>
+    <w:p/>
     <w:p>
       <w:r>
         <w:t>**Corretor:** Depende do contrato. Pode haver benefícios para internação, cirurgia, tratamento ambulatorial e tratamento avançado.</w:t>
       </w:r>
     </w:p>
+    <w:p/>
     <w:p>
       <w:r>
         <w:t>**Cliente:** Se eu já tiver doença, posso contratar?</w:t>
       </w:r>
     </w:p>
+    <w:p/>
     <w:p>
       <w:r>
         <w:t>**Corretor:** A seguradora analisa a condição de saúde e a declaração. É importante informar corretamente.</w:t>
       </w:r>
     </w:p>
+    <w:p/>
     <w:p>
       <w:pPr>
         <w:pStyle w:val="Heading2"/>
@@ -1367,6 +1736,7 @@
         <w:t>Notas culturais ou comerciais</w:t>
       </w:r>
     </w:p>
+    <w:p/>
     <w:p>
       <w:pPr>
         <w:pStyle w:val="ListBullet"/>
@@ -1383,14 +1753,68 @@
         <w:t>Separar benefício contratado de reembolso médico genérico.</w:t>
       </w:r>
     </w:p>
+    <w:p/>
     <w:p>
       <w:pPr>
         <w:pStyle w:val="Heading2"/>
       </w:pPr>
       <w:r>
+        <w:t>Pontos de atenção para o corretor</w:t>
+      </w:r>
+    </w:p>
+    <w:p/>
+    <w:p>
+      <w:pPr>
+        <w:pStyle w:val="ListBullet"/>
+      </w:pPr>
+      <w:r>
+        <w:t>Registrar a dúvida principal do cliente antes de explicar detalhes técnicos.</w:t>
+      </w:r>
+    </w:p>
+    <w:p>
+      <w:pPr>
+        <w:pStyle w:val="ListBullet"/>
+      </w:pPr>
+      <w:r>
+        <w:t>Separar explicação comercial de decisão formal da seguradora.</w:t>
+      </w:r>
+    </w:p>
+    <w:p>
+      <w:pPr>
+        <w:pStyle w:val="ListBullet"/>
+      </w:pPr>
+      <w:r>
+        <w:t>Confirmar contrato, documentos e declaração de saúde antes de responder sobre pagamento.</w:t>
+      </w:r>
+    </w:p>
+    <w:p/>
+    <w:p>
+      <w:pPr>
+        <w:pStyle w:val="Heading2"/>
+      </w:pPr>
+      <w:r>
+        <w:t>Casos relacionados</w:t>
+      </w:r>
+    </w:p>
+    <w:p/>
+    <w:p>
+      <w:pPr>
+        <w:pStyle w:val="ListBullet"/>
+      </w:pPr>
+      <w:r>
+        <w:t>CASE-MED-0006</w:t>
+      </w:r>
+    </w:p>
+    <w:p/>
+    <w:p>
+      <w:pPr>
+        <w:pStyle w:val="Heading2"/>
+      </w:pPr>
+      <w:r>
         <w:t>Termos relacionados</w:t>
       </w:r>
     </w:p>
+    <w:p/>
     <w:p>
       <w:pPr>
         <w:pStyle w:val="ListBullet"/>
@@ -1423,6 +1847,7 @@
         <w:t>MED-0016 - 異常分娩 - Parto com complicação</w:t>
       </w:r>
     </w:p>
+    <w:p/>
     <w:p>
       <w:pPr>
         <w:pStyle w:val="Heading2"/>
@@ -1431,6 +1856,7 @@
         <w:t>FAQs relacionadas</w:t>
       </w:r>
     </w:p>
+    <w:p/>
     <w:p>
       <w:pPr>
         <w:pStyle w:val="ListBullet"/>
@@ -1463,6 +1889,7 @@
         <w:t>FAQ-MED-0016</w:t>
       </w:r>
     </w:p>
+    <w:p/>
     <w:p>
       <w:pPr>
         <w:pStyle w:val="Heading2"/>
@@ -1471,6 +1898,7 @@
         <w:t>Referências cruzadas</w:t>
       </w:r>
     </w:p>
+    <w:p/>
     <w:p>
       <w:pPr>
         <w:pStyle w:val="ListBullet"/>
@@ -1479,6 +1907,7 @@
         <w:t>CASE-MED-0006</w:t>
       </w:r>
     </w:p>
+    <w:p/>
     <w:p>
       <w:pPr>
         <w:pStyle w:val="Heading2"/>
@@ -1487,6 +1916,7 @@
         <w:t>Referências</w:t>
       </w:r>
     </w:p>
+    <w:p/>
     <w:p>
       <w:pPr>
         <w:pStyle w:val="ListBullet"/>
@@ -1495,6 +1925,7 @@
         <w:t>Documento interno: `02_MasterDictionary/MED/MED-0013.md`</w:t>
       </w:r>
     </w:p>
+    <w:p/>
     <w:p>
       <w:pPr>
         <w:pStyle w:val="Heading2"/>
@@ -1503,6 +1934,7 @@
         <w:t>Tags</w:t>
       </w:r>
     </w:p>
+    <w:p/>
     <w:p>
       <w:pPr>
         <w:pStyle w:val="ListBullet"/>
@@ -1535,6 +1967,7 @@
         <w:t>atendimento</w:t>
       </w:r>
     </w:p>
+    <w:p/>
     <w:p>
       <w:pPr>
         <w:pStyle w:val="Heading2"/>
@@ -1543,6 +1976,7 @@
         <w:t>Veja também</w:t>
       </w:r>
     </w:p>
+    <w:p/>
     <w:p>
       <w:pPr>
         <w:pStyle w:val="ListBullet"/>
@@ -1551,6 +1985,7 @@
         <w:t>`14_FAQ/MED/FAQ-MED-0013.md`</w:t>
       </w:r>
     </w:p>
+    <w:p/>
     <w:p>
       <w:pPr>
         <w:pStyle w:val="Heading2"/>
@@ -1559,6 +1994,7 @@
         <w:t>Histórico de revisão</w:t>
       </w:r>
     </w:p>
+    <w:p/>
     <w:p>
       <w:r>
         <w:t>| Data | Versão | Autor | Alteração |</w:t>
@@ -1576,9 +2012,16 @@
     </w:p>
     <w:p>
       <w:r>
-        <w:t>————————————————————————</w:t>
-      </w:r>
-    </w:p>
+        <w:t>| 2026-06-27 | 0.2 | JP-BR Insurance Knowledge Base | Inclusão de pontos de atenção para o corretor e casos relacionados. |</w:t>
+      </w:r>
+    </w:p>
+    <w:p/>
+    <w:p>
+      <w:r>
+        <w:br w:type="page"/>
+      </w:r>
+    </w:p>
+    <w:p/>
     <w:p>
       <w:pPr>
         <w:pStyle w:val="Heading1"/>
@@ -1587,6 +2030,7 @@
         <w:t>DIALOGUE-MED-0005 - Explicando saúde mental, doença prévia, declaração e início de cobertura</w:t>
       </w:r>
     </w:p>
+    <w:p/>
     <w:p>
       <w:pPr>
         <w:pStyle w:val="Heading2"/>
@@ -1595,12 +2039,13 @@
         <w:t>Controle</w:t>
       </w:r>
     </w:p>
+    <w:p/>
     <w:p>
       <w:pPr>
         <w:pStyle w:val="ListBullet"/>
       </w:pPr>
       <w:r>
-        <w:t>Versão: 0.1</w:t>
+        <w:t>Versão: 0.2</w:t>
       </w:r>
     </w:p>
     <w:p>
@@ -1624,9 +2069,10 @@
         <w:pStyle w:val="ListBullet"/>
       </w:pPr>
       <w:r>
-        <w:t>Histórico: Criação inicial.</w:t>
-      </w:r>
-    </w:p>
+        <w:t>Histórico: Criação inicial; reforço de pontos de atenção e casos relacionados.</w:t>
+      </w:r>
+    </w:p>
+    <w:p/>
     <w:p>
       <w:pPr>
         <w:pStyle w:val="Heading2"/>
@@ -1635,11 +2081,13 @@
         <w:t>Código</w:t>
       </w:r>
     </w:p>
+    <w:p/>
     <w:p>
       <w:r>
         <w:t>DIALOGUE-MED-0005</w:t>
       </w:r>
     </w:p>
+    <w:p/>
     <w:p>
       <w:pPr>
         <w:pStyle w:val="Heading2"/>
@@ -1648,11 +2096,13 @@
         <w:t>Situação de atendimento</w:t>
       </w:r>
     </w:p>
+    <w:p/>
     <w:p>
       <w:r>
         <w:t>Cliente brasileiro quer entender como funciona o seguro médico no Japão.</w:t>
       </w:r>
     </w:p>
+    <w:p/>
     <w:p>
       <w:pPr>
         <w:pStyle w:val="Heading2"/>
@@ -1661,6 +2111,7 @@
         <w:t>Participantes</w:t>
       </w:r>
     </w:p>
+    <w:p/>
     <w:p>
       <w:pPr>
         <w:pStyle w:val="ListBullet"/>
@@ -1677,6 +2128,7 @@
         <w:t>Cliente: cliente brasileiro residente no Japão</w:t>
       </w:r>
     </w:p>
+    <w:p/>
     <w:p>
       <w:pPr>
         <w:pStyle w:val="Heading2"/>
@@ -1685,11 +2137,13 @@
         <w:t>Objetivo do diálogo</w:t>
       </w:r>
     </w:p>
+    <w:p/>
     <w:p>
       <w:r>
         <w:t>Explicando saúde mental, doença prévia, declaração e início de cobertura.</w:t>
       </w:r>
     </w:p>
+    <w:p/>
     <w:p>
       <w:pPr>
         <w:pStyle w:val="Heading2"/>
@@ -1698,26 +2152,31 @@
         <w:t>Versão em japonês</w:t>
       </w:r>
     </w:p>
+    <w:p/>
     <w:p>
       <w:r>
         <w:t>**Cliente:** 医療保険では何が支払われますか。</w:t>
       </w:r>
     </w:p>
+    <w:p/>
     <w:p>
       <w:r>
         <w:t>**Corretor:** 入院、手術、通院、先進医療など、契約内容によって支払い対象が異なります。</w:t>
       </w:r>
     </w:p>
+    <w:p/>
     <w:p>
       <w:r>
         <w:t>**Cliente:** 病気があれば入れますか。</w:t>
       </w:r>
     </w:p>
+    <w:p/>
     <w:p>
       <w:r>
         <w:t>**Corretor:** 健康状態や告知内容を保険会社が確認します。正確に申告することが大切です。</w:t>
       </w:r>
     </w:p>
+    <w:p/>
     <w:p>
       <w:pPr>
         <w:pStyle w:val="Heading2"/>
@@ -1726,26 +2185,31 @@
         <w:t>Versão em português brasileiro</w:t>
       </w:r>
     </w:p>
+    <w:p/>
     <w:p>
       <w:r>
         <w:t>**Cliente:** O que o seguro médico paga?</w:t>
       </w:r>
     </w:p>
+    <w:p/>
     <w:p>
       <w:r>
         <w:t>**Corretor:** Depende do contrato. Pode haver benefícios para internação, cirurgia, tratamento ambulatorial e tratamento avançado.</w:t>
       </w:r>
     </w:p>
+    <w:p/>
     <w:p>
       <w:r>
         <w:t>**Cliente:** Se eu já tiver doença, posso contratar?</w:t>
       </w:r>
     </w:p>
+    <w:p/>
     <w:p>
       <w:r>
         <w:t>**Corretor:** A seguradora analisa a condição de saúde e a declaração. É importante informar corretamente.</w:t>
       </w:r>
     </w:p>
+    <w:p/>
     <w:p>
       <w:pPr>
         <w:pStyle w:val="Heading2"/>
@@ -1754,6 +2218,7 @@
         <w:t>Notas culturais ou comerciais</w:t>
       </w:r>
     </w:p>
+    <w:p/>
     <w:p>
       <w:pPr>
         <w:pStyle w:val="ListBullet"/>
@@ -1770,14 +2235,76 @@
         <w:t>Separar benefício contratado de reembolso médico genérico.</w:t>
       </w:r>
     </w:p>
+    <w:p/>
     <w:p>
       <w:pPr>
         <w:pStyle w:val="Heading2"/>
       </w:pPr>
       <w:r>
+        <w:t>Pontos de atenção para o corretor</w:t>
+      </w:r>
+    </w:p>
+    <w:p/>
+    <w:p>
+      <w:pPr>
+        <w:pStyle w:val="ListBullet"/>
+      </w:pPr>
+      <w:r>
+        <w:t>Registrar a dúvida principal do cliente antes de explicar detalhes técnicos.</w:t>
+      </w:r>
+    </w:p>
+    <w:p>
+      <w:pPr>
+        <w:pStyle w:val="ListBullet"/>
+      </w:pPr>
+      <w:r>
+        <w:t>Separar explicação comercial de decisão formal da seguradora.</w:t>
+      </w:r>
+    </w:p>
+    <w:p>
+      <w:pPr>
+        <w:pStyle w:val="ListBullet"/>
+      </w:pPr>
+      <w:r>
+        <w:t>Confirmar contrato, documentos e declaração de saúde antes de responder sobre pagamento.</w:t>
+      </w:r>
+    </w:p>
+    <w:p/>
+    <w:p>
+      <w:pPr>
+        <w:pStyle w:val="Heading2"/>
+      </w:pPr>
+      <w:r>
+        <w:t>Casos relacionados</w:t>
+      </w:r>
+    </w:p>
+    <w:p/>
+    <w:p>
+      <w:pPr>
+        <w:pStyle w:val="ListBullet"/>
+      </w:pPr>
+      <w:r>
+        <w:t>CASE-MED-0007</w:t>
+      </w:r>
+    </w:p>
+    <w:p>
+      <w:pPr>
+        <w:pStyle w:val="ListBullet"/>
+      </w:pPr>
+      <w:r>
+        <w:t>CASE-MED-0008</w:t>
+      </w:r>
+    </w:p>
+    <w:p/>
+    <w:p>
+      <w:pPr>
+        <w:pStyle w:val="Heading2"/>
+      </w:pPr>
+      <w:r>
         <w:t>Termos relacionados</w:t>
       </w:r>
     </w:p>
+    <w:p/>
     <w:p>
       <w:pPr>
         <w:pStyle w:val="ListBullet"/>
@@ -1810,6 +2337,7 @@
         <w:t>MED-0020 - 責任開始日 - Data de início da cobertura</w:t>
       </w:r>
     </w:p>
+    <w:p/>
     <w:p>
       <w:pPr>
         <w:pStyle w:val="Heading2"/>
@@ -1818,6 +2346,7 @@
         <w:t>FAQs relacionadas</w:t>
       </w:r>
     </w:p>
+    <w:p/>
     <w:p>
       <w:pPr>
         <w:pStyle w:val="ListBullet"/>
@@ -1850,6 +2379,7 @@
         <w:t>FAQ-MED-0020</w:t>
       </w:r>
     </w:p>
+    <w:p/>
     <w:p>
       <w:pPr>
         <w:pStyle w:val="Heading2"/>
@@ -1858,6 +2388,7 @@
         <w:t>Referências cruzadas</w:t>
       </w:r>
     </w:p>
+    <w:p/>
     <w:p>
       <w:pPr>
         <w:pStyle w:val="ListBullet"/>
@@ -1874,6 +2405,7 @@
         <w:t>CASE-MED-0008</w:t>
       </w:r>
     </w:p>
+    <w:p/>
     <w:p>
       <w:pPr>
         <w:pStyle w:val="Heading2"/>
@@ -1882,6 +2414,7 @@
         <w:t>Referências</w:t>
       </w:r>
     </w:p>
+    <w:p/>
     <w:p>
       <w:pPr>
         <w:pStyle w:val="ListBullet"/>
@@ -1890,6 +2423,7 @@
         <w:t>Documento interno: `02_MasterDictionary/MED/MED-0017.md`</w:t>
       </w:r>
     </w:p>
+    <w:p/>
     <w:p>
       <w:pPr>
         <w:pStyle w:val="Heading2"/>
@@ -1898,6 +2432,7 @@
         <w:t>Tags</w:t>
       </w:r>
     </w:p>
+    <w:p/>
     <w:p>
       <w:pPr>
         <w:pStyle w:val="ListBullet"/>
@@ -1930,6 +2465,7 @@
         <w:t>atendimento</w:t>
       </w:r>
     </w:p>
+    <w:p/>
     <w:p>
       <w:pPr>
         <w:pStyle w:val="Heading2"/>
@@ -1938,6 +2474,7 @@
         <w:t>Veja também</w:t>
       </w:r>
     </w:p>
+    <w:p/>
     <w:p>
       <w:pPr>
         <w:pStyle w:val="ListBullet"/>
@@ -1946,6 +2483,7 @@
         <w:t>`14_FAQ/MED/FAQ-MED-0017.md`</w:t>
       </w:r>
     </w:p>
+    <w:p/>
     <w:p>
       <w:pPr>
         <w:pStyle w:val="Heading2"/>
@@ -1954,6 +2492,7 @@
         <w:t>Histórico de revisão</w:t>
       </w:r>
     </w:p>
+    <w:p/>
     <w:p>
       <w:r>
         <w:t>| Data | Versão | Autor | Alteração |</w:t>
@@ -1967,6 +2506,36 @@
     <w:p>
       <w:r>
         <w:t>| 2026-06-26 | 0.1 | JP-BR Insurance Knowledge Base | Criação inicial. |</w:t>
+      </w:r>
+    </w:p>
+    <w:p>
+      <w:r>
+        <w:t>| 2026-06-27 | 0.2 | JP-BR Insurance Knowledge Base | Inclusão de pontos de atenção para o corretor e casos relacionados. |</w:t>
+      </w:r>
+    </w:p>
+    <w:p/>
+    <w:p>
+      <w:pPr>
+        <w:pStyle w:val="Heading2"/>
+      </w:pPr>
+      <w:r>
+        <w:t>Histórico de revisão</w:t>
+      </w:r>
+    </w:p>
+    <w:p/>
+    <w:p>
+      <w:r>
+        <w:t>| Data | Versão | Autor | Alteração |</w:t>
+      </w:r>
+    </w:p>
+    <w:p>
+      <w:r>
+        <w:t>| --- | --- | --- | --- |</w:t>
+      </w:r>
+    </w:p>
+    <w:p>
+      <w:r>
+        <w:t>| 2026-06-27 | 0.2 | JP-BR Insurance Knowledge Base | Regeneração do pacote com normalização dos diálogos MED 0001-0005. |</w:t>
       </w:r>
     </w:p>
     <w:sectPr>
@@ -2343,7 +2912,7 @@
     <w:qFormat/>
     <w:rsid w:val="00FC693F"/>
     <w:rPr>
-      <w:rFonts w:ascii="Arial Unicode MS" w:hAnsi="Arial Unicode MS"/>
+      <w:rFonts w:ascii="Arial" w:hAnsi="Arial"/>
       <w:sz w:val="20"/>
     </w:rPr>
   </w:style>

</xml_diff>